<commit_message>
feat: complete IG scraper with followers and following for user-ig account
</commit_message>
<xml_diff>
--- a/ConclusionAmaranta_ScrapingWeb.docx
+++ b/ConclusionAmaranta_ScrapingWeb.docx
@@ -546,7 +546,7 @@
           <w:szCs w:val="28"/>
           <w:lang w:val="es-ES"/>
         </w:rPr>
-        <w:t>A partir de la data extraída en el archivo JSON, se identificaron los siguientes patrones de comportamiento que nos permiten perfilar a la usuaria:</w:t>
+        <w:t>A partir de la data extraída, se identificaron los siguientes patrones de comportamiento:</w:t>
       </w:r>
     </w:p>
     <w:p>
@@ -599,7 +599,7 @@
           <w:szCs w:val="28"/>
           <w:lang w:val="es-ES"/>
         </w:rPr>
-        <w:t xml:space="preserve"> De las 10 publicaciones extraídas, utiliza 7 para promocionar productos de empresas. Específicamente, 6 de los 10 posts son en colaboración con @FashionNova y el restante con </w:t>
+        <w:t xml:space="preserve"> De las 10 publicaciones extraídas, utiliza 7 para promocionar productos de empresas (6 con @FashionNova y 1 con </w:t>
       </w:r>
       <w:proofErr w:type="spellStart"/>
       <w:r>
@@ -619,7 +619,7 @@
           <w:szCs w:val="28"/>
           <w:lang w:val="es-ES"/>
         </w:rPr>
-        <w:t xml:space="preserve"> Paris.</w:t>
+        <w:t xml:space="preserve"> Paris).</w:t>
       </w:r>
     </w:p>
     <w:p>
@@ -649,7 +649,7 @@
           <w:szCs w:val="28"/>
           <w:lang w:val="es-ES"/>
         </w:rPr>
-        <w:t xml:space="preserve"> Esto da a entender que es una </w:t>
+        <w:t xml:space="preserve"> Esto indica que es una </w:t>
       </w:r>
       <w:proofErr w:type="spellStart"/>
       <w:proofErr w:type="gramStart"/>
@@ -671,7 +671,7 @@
           <w:szCs w:val="28"/>
           <w:lang w:val="es-ES"/>
         </w:rPr>
-        <w:t xml:space="preserve"> muy fiel a una marca matriz. Indica que utiliza su cuenta principal y activamente para trabajo de publicidad, entiende los números que genera con sus posts y los aprovecha para monetizar con marcas importantes. En el modelo psicológico, esto refleja un nivel alto de Responsabilidad, demostrando disciplina y enfoque estructurado en sus negocios.</w:t>
+        <w:t xml:space="preserve"> fiel a una marca matriz y utiliza su cuenta como una plataforma de trabajo profesional. Demuestra que entiende el impacto de sus números y los gestiona con disciplina. En el modelo Big Five, esto refleja un nivel alto de Responsabilidad, evidenciando un enfoque estructurado y orientado a objetivos comerciales.</w:t>
       </w:r>
     </w:p>
     <w:p>
@@ -724,7 +724,7 @@
           <w:szCs w:val="28"/>
           <w:lang w:val="es-ES"/>
         </w:rPr>
-        <w:t xml:space="preserve"> En el 100% de las publicaciones utiliza emojis. Además, cuando sube fotografías sola, suele evitar textos largos en la descripción y prefiere usar únicamente secuencias cortas de 3 a 4 emojis (ej. </w:t>
+        <w:t xml:space="preserve"> En el 100% de las publicaciones utiliza emojis. En fotografías individuales, evita descripciones extensas y utiliza secuencias cortas de 3 a 4 emojis (ej. </w:t>
       </w:r>
       <w:r>
         <w:rPr>
@@ -790,7 +790,7 @@
           <w:szCs w:val="28"/>
           <w:lang w:val="es-ES"/>
         </w:rPr>
-        <w:t xml:space="preserve"> Esto quiere decir que su estilo de comunicación es extremadamente visual, rápido y directo. No necesita de grandes redacciones para conectar con su audiencia, prefiriendo transmitir emociones gráficas. Esto sugiere un nivel alto de Extraversión, propio de personas enérgicas que buscan captar la atención de forma inmediata a través de la estética.</w:t>
+        <w:t xml:space="preserve"> Su estilo es puramente visual y directo, buscando captar la atención mediante la estética sin necesidad de narrativa textual. Esto sugiere un nivel alto de Extraversión, característico de personas enérgicas que se sienten cómodas siendo el centro de atención y comunicando emociones de forma rápida.</w:t>
       </w:r>
     </w:p>
     <w:p>
@@ -843,37 +843,203 @@
           <w:szCs w:val="28"/>
           <w:lang w:val="es-ES"/>
         </w:rPr>
-        <w:t xml:space="preserve"> Al analizar las muestras de los comentarios extraídos, se evidencia un apoyo masivo hacia ella. Los textos están llenos de palabras cálidas ("linda", "diosa", "increíble") y no se detectó ruido de confrontaciones o toxicidad en los primeros niveles de interacción.</w:t>
-      </w:r>
-    </w:p>
-    <w:p>
-      <w:pPr>
-        <w:rPr>
-          <w:rFonts w:ascii="Times New Roman" w:hAnsi="Times New Roman" w:cs="Times New Roman"/>
-          <w:sz w:val="28"/>
-          <w:szCs w:val="28"/>
-          <w:lang w:val="es-EC"/>
-        </w:rPr>
-      </w:pPr>
-      <w:r>
-        <w:rPr>
-          <w:rFonts w:ascii="Times New Roman" w:hAnsi="Times New Roman" w:cs="Times New Roman"/>
-          <w:b/>
-          <w:bCs/>
-          <w:sz w:val="28"/>
-          <w:szCs w:val="28"/>
-          <w:lang w:val="es-ES"/>
-        </w:rPr>
-        <w:t>Conclusión</w:t>
-      </w:r>
-      <w:r>
-        <w:rPr>
-          <w:rFonts w:ascii="Times New Roman" w:hAnsi="Times New Roman" w:cs="Times New Roman"/>
-          <w:sz w:val="28"/>
-          <w:szCs w:val="28"/>
-          <w:lang w:val="es-ES"/>
-        </w:rPr>
-        <w:t>: Esto nos indica que ha logrado consolidar una comunidad muy unida y leal. Psicológicamente, la audiencia refleja lo que el creador proyecta; por lo tanto, esta calidez en los comentarios sugiere que la usuaria proyecta un trato cercano y empático, lo que se traduce en un nivel alto de Amabilidad.</w:t>
+        <w:t xml:space="preserve"> Los comentarios extraídos muestran un apoyo masivo con léxico cálido ("linda", "diosa", "increíble") y nula toxicidad en los primeros niveles de interacción.</w:t>
+      </w:r>
+    </w:p>
+    <w:p>
+      <w:pPr>
+        <w:rPr>
+          <w:rFonts w:ascii="Times New Roman" w:hAnsi="Times New Roman" w:cs="Times New Roman"/>
+          <w:sz w:val="28"/>
+          <w:szCs w:val="28"/>
+          <w:lang w:val="es-ES"/>
+        </w:rPr>
+      </w:pPr>
+      <w:r>
+        <w:rPr>
+          <w:rFonts w:ascii="Times New Roman" w:hAnsi="Times New Roman" w:cs="Times New Roman"/>
+          <w:b/>
+          <w:bCs/>
+          <w:sz w:val="28"/>
+          <w:szCs w:val="28"/>
+          <w:lang w:val="es-ES"/>
+        </w:rPr>
+        <w:t>Conclusión:</w:t>
+      </w:r>
+      <w:r>
+        <w:rPr>
+          <w:rFonts w:ascii="Times New Roman" w:hAnsi="Times New Roman" w:cs="Times New Roman"/>
+          <w:sz w:val="28"/>
+          <w:szCs w:val="28"/>
+          <w:lang w:val="es-ES"/>
+        </w:rPr>
+        <w:t xml:space="preserve"> Una comunidad tan leal es reflejo de lo que el emisor proyecta. Esta calidez sugiere que la usuaria proyecta empatía y cercanía, traduciéndose en un nivel alto de Amabilidad.</w:t>
+      </w:r>
+    </w:p>
+    <w:p>
+      <w:pPr>
+        <w:rPr>
+          <w:rFonts w:ascii="Times New Roman" w:hAnsi="Times New Roman" w:cs="Times New Roman"/>
+          <w:b/>
+          <w:bCs/>
+          <w:sz w:val="28"/>
+          <w:szCs w:val="28"/>
+          <w:lang w:val="es-ES"/>
+        </w:rPr>
+      </w:pPr>
+      <w:r>
+        <w:rPr>
+          <w:rFonts w:ascii="Times New Roman" w:hAnsi="Times New Roman" w:cs="Times New Roman"/>
+          <w:b/>
+          <w:bCs/>
+          <w:sz w:val="28"/>
+          <w:szCs w:val="28"/>
+          <w:lang w:val="es-ES"/>
+        </w:rPr>
+        <w:t>4. Patrón de Autoridad y Estatus (Apertura y Estabilidad):</w:t>
+      </w:r>
+    </w:p>
+    <w:p>
+      <w:pPr>
+        <w:rPr>
+          <w:rFonts w:ascii="Times New Roman" w:hAnsi="Times New Roman" w:cs="Times New Roman"/>
+          <w:sz w:val="28"/>
+          <w:szCs w:val="28"/>
+          <w:lang w:val="es-ES"/>
+        </w:rPr>
+      </w:pPr>
+      <w:r>
+        <w:rPr>
+          <w:rFonts w:ascii="Times New Roman" w:hAnsi="Times New Roman" w:cs="Times New Roman"/>
+          <w:b/>
+          <w:bCs/>
+          <w:sz w:val="28"/>
+          <w:szCs w:val="28"/>
+          <w:lang w:val="es-ES"/>
+        </w:rPr>
+        <w:t>Observación:</w:t>
+      </w:r>
+      <w:r>
+        <w:rPr>
+          <w:rFonts w:ascii="Times New Roman" w:hAnsi="Times New Roman" w:cs="Times New Roman"/>
+          <w:sz w:val="28"/>
+          <w:szCs w:val="28"/>
+          <w:lang w:val="es-ES"/>
+        </w:rPr>
+        <w:t xml:space="preserve"> Se identificó </w:t>
+      </w:r>
+      <w:proofErr w:type="gramStart"/>
+      <w:r>
+        <w:rPr>
+          <w:rFonts w:ascii="Times New Roman" w:hAnsi="Times New Roman" w:cs="Times New Roman"/>
+          <w:sz w:val="28"/>
+          <w:szCs w:val="28"/>
+          <w:lang w:val="es-ES"/>
+        </w:rPr>
+        <w:t>un ratio</w:t>
+      </w:r>
+      <w:proofErr w:type="gramEnd"/>
+      <w:r>
+        <w:rPr>
+          <w:rFonts w:ascii="Times New Roman" w:hAnsi="Times New Roman" w:cs="Times New Roman"/>
+          <w:sz w:val="28"/>
+          <w:szCs w:val="28"/>
+          <w:lang w:val="es-ES"/>
+        </w:rPr>
+        <w:t xml:space="preserve"> de red de 4.6 millones de seguidores frente a solo 459 seguidos. Además, su biografía incluye un correo de contacto corporativo (@rawtalent.co).</w:t>
+      </w:r>
+    </w:p>
+    <w:p>
+      <w:pPr>
+        <w:rPr>
+          <w:rFonts w:ascii="Times New Roman" w:hAnsi="Times New Roman" w:cs="Times New Roman"/>
+          <w:sz w:val="28"/>
+          <w:szCs w:val="28"/>
+          <w:lang w:val="es-ES"/>
+        </w:rPr>
+      </w:pPr>
+      <w:r>
+        <w:rPr>
+          <w:rFonts w:ascii="Times New Roman" w:hAnsi="Times New Roman" w:cs="Times New Roman"/>
+          <w:b/>
+          <w:bCs/>
+          <w:sz w:val="28"/>
+          <w:szCs w:val="28"/>
+          <w:lang w:val="es-ES"/>
+        </w:rPr>
+        <w:t>Conclusión:</w:t>
+      </w:r>
+      <w:r>
+        <w:rPr>
+          <w:rFonts w:ascii="Times New Roman" w:hAnsi="Times New Roman" w:cs="Times New Roman"/>
+          <w:sz w:val="28"/>
+          <w:szCs w:val="28"/>
+          <w:lang w:val="es-ES"/>
+        </w:rPr>
+        <w:t xml:space="preserve"> Esta desproporción (10,000 a 1) posiciona al perfil como un "Emisor de Tendencias" y no como un consumidor. La presencia de una agencia de talentos confirma que su gestión es profesionalizada. Psicológicamente, esto indica una alta Estabilidad Emocional y seguridad </w:t>
+      </w:r>
+      <w:r>
+        <w:rPr>
+          <w:rFonts w:ascii="Times New Roman" w:hAnsi="Times New Roman" w:cs="Times New Roman"/>
+          <w:sz w:val="28"/>
+          <w:szCs w:val="28"/>
+          <w:lang w:val="es-ES"/>
+        </w:rPr>
+        <w:lastRenderedPageBreak/>
+        <w:t>en su estatus social, filtrando rigurosamente su entorno digital y priorizando la calidad de su red sobre la cantidad.</w:t>
+      </w:r>
+    </w:p>
+    <w:p>
+      <w:pPr>
+        <w:rPr>
+          <w:rFonts w:ascii="Times New Roman" w:hAnsi="Times New Roman" w:cs="Times New Roman"/>
+          <w:b/>
+          <w:bCs/>
+          <w:sz w:val="28"/>
+          <w:szCs w:val="28"/>
+          <w:lang w:val="es-ES"/>
+        </w:rPr>
+      </w:pPr>
+      <w:r>
+        <w:rPr>
+          <w:rFonts w:ascii="Times New Roman" w:hAnsi="Times New Roman" w:cs="Times New Roman"/>
+          <w:b/>
+          <w:bCs/>
+          <w:sz w:val="28"/>
+          <w:szCs w:val="28"/>
+          <w:lang w:val="es-ES"/>
+        </w:rPr>
+        <w:t>5. Patrón de Eficiencia (Estrategia):</w:t>
+      </w:r>
+    </w:p>
+    <w:p>
+      <w:pPr>
+        <w:rPr>
+          <w:rFonts w:ascii="Times New Roman" w:hAnsi="Times New Roman" w:cs="Times New Roman"/>
+          <w:sz w:val="28"/>
+          <w:szCs w:val="28"/>
+          <w:lang w:val="es-ES"/>
+        </w:rPr>
+      </w:pPr>
+      <w:r>
+        <w:rPr>
+          <w:rFonts w:ascii="Times New Roman" w:hAnsi="Times New Roman" w:cs="Times New Roman"/>
+          <w:b/>
+          <w:bCs/>
+          <w:sz w:val="28"/>
+          <w:szCs w:val="28"/>
+          <w:lang w:val="es-ES"/>
+        </w:rPr>
+        <w:t>Observación:</w:t>
+      </w:r>
+      <w:r>
+        <w:rPr>
+          <w:rFonts w:ascii="Times New Roman" w:hAnsi="Times New Roman" w:cs="Times New Roman"/>
+          <w:sz w:val="28"/>
+          <w:szCs w:val="28"/>
+          <w:lang w:val="es-ES"/>
+        </w:rPr>
+        <w:t xml:space="preserve"> Posee una audiencia masiva (4.6M) con apenas 237 publicaciones totales.</w:t>
       </w:r>
     </w:p>
     <w:p>
@@ -885,6 +1051,26 @@
           <w:lang w:val="es-ES"/>
         </w:rPr>
       </w:pPr>
+      <w:r>
+        <w:rPr>
+          <w:rFonts w:ascii="Times New Roman" w:hAnsi="Times New Roman" w:cs="Times New Roman"/>
+          <w:b/>
+          <w:bCs/>
+          <w:sz w:val="28"/>
+          <w:szCs w:val="28"/>
+          <w:lang w:val="es-ES"/>
+        </w:rPr>
+        <w:t>Conclusión:</w:t>
+      </w:r>
+      <w:r>
+        <w:rPr>
+          <w:rFonts w:ascii="Times New Roman" w:hAnsi="Times New Roman" w:cs="Times New Roman"/>
+          <w:sz w:val="28"/>
+          <w:szCs w:val="28"/>
+          <w:lang w:val="es-ES"/>
+        </w:rPr>
+        <w:t xml:space="preserve"> Existe una eficiencia de contenido muy alta, donde cada post genera un impacto masivo de crecimiento. Esto refuerza el rasgo de Responsabilidad y Apertura, indicando que no publica por impulso, sino bajo una estrategia analítica donde cada pieza de contenido está optimizada para el éxito algorítmico.</w:t>
+      </w:r>
     </w:p>
     <w:sectPr>
       <w:pgSz w:w="11906" w:h="16838"/>
@@ -1212,6 +1398,7 @@
   <w:style w:type="character" w:default="1" w:styleId="Fuentedeprrafopredeter">
     <w:name w:val="Default Paragraph Font"/>
     <w:uiPriority w:val="1"/>
+    <w:semiHidden/>
     <w:unhideWhenUsed/>
   </w:style>
   <w:style w:type="table" w:default="1" w:styleId="Tablanormal">

</xml_diff>